<commit_message>
Align user manual DOCX to Bowman Brand Standards palette
The manual previously used an older Bowman blue palette
(#1F4E79 / #2E75B6). Switch to the official 2025 Brand Standards
palette (Brand Green #00593d / Brand Blue #03425b) so the manual
matches the freshly-rebranded PDF report.

- build_manual_docx.py: heading colors H1/H2 now Brand Green,
  H3/H4 now Brand Blue; title page SPORK wordmark uses Brand
  Green, subtitle uses Brand Blue; table header rows use Brand
  Green background.
- Regenerated SPORK_User_Manual_v1.3.docx with the new palette.
- MIGRATION_BRIEF.md updated: manual alignment note marked done.

Co-Authored-By: Claude Opus 4.7 (1M context) <noreply@anthropic.com>
</commit_message>
<xml_diff>
--- a/docs/SPORK_User_Manual_v1.3.docx
+++ b/docs/SPORK_User_Manual_v1.3.docx
@@ -13,7 +13,7 @@
       <w:r>
         <w:rPr>
           <w:b/>
-          <w:color w:val="1F4E79"/>
+          <w:color w:val="00593D"/>
           <w:sz w:val="84"/>
         </w:rPr>
         <w:t>SPORK</w:t>
@@ -25,7 +25,7 @@
       </w:pPr>
       <w:r>
         <w:rPr>
-          <w:color w:val="2E75B6"/>
+          <w:color w:val="03425B"/>
           <w:sz w:val="40"/>
         </w:rPr>
         <w:t>Solar Pile Optimization &amp; Report Kit</w:t>
@@ -1151,7 +1151,7 @@
         <w:tc>
           <w:tcPr>
             <w:tcW w:type="dxa" w:w="4680"/>
-            <w:shd w:fill="1F4E79"/>
+            <w:shd w:fill="00593D"/>
           </w:tcPr>
           <w:p>
             <w:pPr>
@@ -1178,7 +1178,7 @@
         <w:tc>
           <w:tcPr>
             <w:tcW w:type="dxa" w:w="4680"/>
-            <w:shd w:fill="1F4E79"/>
+            <w:shd w:fill="00593D"/>
           </w:tcPr>
           <w:p>
             <w:pPr>
@@ -1375,7 +1375,7 @@
         <w:tc>
           <w:tcPr>
             <w:tcW w:type="dxa" w:w="4680"/>
-            <w:shd w:fill="1F4E79"/>
+            <w:shd w:fill="00593D"/>
           </w:tcPr>
           <w:p>
             <w:pPr>
@@ -1402,7 +1402,7 @@
         <w:tc>
           <w:tcPr>
             <w:tcW w:type="dxa" w:w="4680"/>
-            <w:shd w:fill="1F4E79"/>
+            <w:shd w:fill="00593D"/>
           </w:tcPr>
           <w:p>
             <w:pPr>
@@ -1608,7 +1608,7 @@
         <w:tc>
           <w:tcPr>
             <w:tcW w:type="dxa" w:w="4680"/>
-            <w:shd w:fill="1F4E79"/>
+            <w:shd w:fill="00593D"/>
           </w:tcPr>
           <w:p>
             <w:pPr>
@@ -1635,7 +1635,7 @@
         <w:tc>
           <w:tcPr>
             <w:tcW w:type="dxa" w:w="4680"/>
-            <w:shd w:fill="1F4E79"/>
+            <w:shd w:fill="00593D"/>
           </w:tcPr>
           <w:p>
             <w:pPr>
@@ -1814,7 +1814,7 @@
         <w:tc>
           <w:tcPr>
             <w:tcW w:type="dxa" w:w="4680"/>
-            <w:shd w:fill="1F4E79"/>
+            <w:shd w:fill="00593D"/>
           </w:tcPr>
           <w:p>
             <w:pPr>
@@ -1841,7 +1841,7 @@
         <w:tc>
           <w:tcPr>
             <w:tcW w:type="dxa" w:w="4680"/>
-            <w:shd w:fill="1F4E79"/>
+            <w:shd w:fill="00593D"/>
           </w:tcPr>
           <w:p>
             <w:pPr>
@@ -2006,7 +2006,7 @@
         <w:tc>
           <w:tcPr>
             <w:tcW w:type="dxa" w:w="3120"/>
-            <w:shd w:fill="1F4E79"/>
+            <w:shd w:fill="00593D"/>
           </w:tcPr>
           <w:p>
             <w:pPr>
@@ -2033,7 +2033,7 @@
         <w:tc>
           <w:tcPr>
             <w:tcW w:type="dxa" w:w="3120"/>
-            <w:shd w:fill="1F4E79"/>
+            <w:shd w:fill="00593D"/>
           </w:tcPr>
           <w:p>
             <w:pPr>
@@ -2060,7 +2060,7 @@
         <w:tc>
           <w:tcPr>
             <w:tcW w:type="dxa" w:w="3120"/>
-            <w:shd w:fill="1F4E79"/>
+            <w:shd w:fill="00593D"/>
           </w:tcPr>
           <w:p>
             <w:pPr>
@@ -2302,7 +2302,7 @@
         <w:tc>
           <w:tcPr>
             <w:tcW w:type="dxa" w:w="4680"/>
-            <w:shd w:fill="1F4E79"/>
+            <w:shd w:fill="00593D"/>
           </w:tcPr>
           <w:p>
             <w:pPr>
@@ -2329,7 +2329,7 @@
         <w:tc>
           <w:tcPr>
             <w:tcW w:type="dxa" w:w="4680"/>
-            <w:shd w:fill="1F4E79"/>
+            <w:shd w:fill="00593D"/>
           </w:tcPr>
           <w:p>
             <w:pPr>
@@ -2475,7 +2475,7 @@
         <w:tc>
           <w:tcPr>
             <w:tcW w:type="dxa" w:w="2340"/>
-            <w:shd w:fill="1F4E79"/>
+            <w:shd w:fill="00593D"/>
           </w:tcPr>
           <w:p>
             <w:pPr>
@@ -2502,7 +2502,7 @@
         <w:tc>
           <w:tcPr>
             <w:tcW w:type="dxa" w:w="2340"/>
-            <w:shd w:fill="1F4E79"/>
+            <w:shd w:fill="00593D"/>
           </w:tcPr>
           <w:p>
             <w:pPr>
@@ -2529,7 +2529,7 @@
         <w:tc>
           <w:tcPr>
             <w:tcW w:type="dxa" w:w="2340"/>
-            <w:shd w:fill="1F4E79"/>
+            <w:shd w:fill="00593D"/>
           </w:tcPr>
           <w:p>
             <w:pPr>
@@ -2556,7 +2556,7 @@
         <w:tc>
           <w:tcPr>
             <w:tcW w:type="dxa" w:w="2340"/>
-            <w:shd w:fill="1F4E79"/>
+            <w:shd w:fill="00593D"/>
           </w:tcPr>
           <w:p>
             <w:pPr>
@@ -3031,7 +3031,7 @@
         <w:tc>
           <w:tcPr>
             <w:tcW w:type="dxa" w:w="2340"/>
-            <w:shd w:fill="1F4E79"/>
+            <w:shd w:fill="00593D"/>
           </w:tcPr>
           <w:p>
             <w:pPr>
@@ -3058,7 +3058,7 @@
         <w:tc>
           <w:tcPr>
             <w:tcW w:type="dxa" w:w="2340"/>
-            <w:shd w:fill="1F4E79"/>
+            <w:shd w:fill="00593D"/>
           </w:tcPr>
           <w:p>
             <w:pPr>
@@ -3085,7 +3085,7 @@
         <w:tc>
           <w:tcPr>
             <w:tcW w:type="dxa" w:w="2340"/>
-            <w:shd w:fill="1F4E79"/>
+            <w:shd w:fill="00593D"/>
           </w:tcPr>
           <w:p>
             <w:pPr>
@@ -3112,7 +3112,7 @@
         <w:tc>
           <w:tcPr>
             <w:tcW w:type="dxa" w:w="2340"/>
-            <w:shd w:fill="1F4E79"/>
+            <w:shd w:fill="00593D"/>
           </w:tcPr>
           <w:p>
             <w:pPr>
@@ -3502,7 +3502,7 @@
         <w:tc>
           <w:tcPr>
             <w:tcW w:type="dxa" w:w="4680"/>
-            <w:shd w:fill="1F4E79"/>
+            <w:shd w:fill="00593D"/>
           </w:tcPr>
           <w:p>
             <w:pPr>
@@ -3529,7 +3529,7 @@
         <w:tc>
           <w:tcPr>
             <w:tcW w:type="dxa" w:w="4680"/>
-            <w:shd w:fill="1F4E79"/>
+            <w:shd w:fill="00593D"/>
           </w:tcPr>
           <w:p>
             <w:pPr>
@@ -4077,7 +4077,7 @@
         <w:tc>
           <w:tcPr>
             <w:tcW w:type="dxa" w:w="3120"/>
-            <w:shd w:fill="1F4E79"/>
+            <w:shd w:fill="00593D"/>
           </w:tcPr>
           <w:p>
             <w:pPr>
@@ -4104,7 +4104,7 @@
         <w:tc>
           <w:tcPr>
             <w:tcW w:type="dxa" w:w="3120"/>
-            <w:shd w:fill="1F4E79"/>
+            <w:shd w:fill="00593D"/>
           </w:tcPr>
           <w:p>
             <w:pPr>
@@ -4131,7 +4131,7 @@
         <w:tc>
           <w:tcPr>
             <w:tcW w:type="dxa" w:w="3120"/>
-            <w:shd w:fill="1F4E79"/>
+            <w:shd w:fill="00593D"/>
           </w:tcPr>
           <w:p>
             <w:pPr>
@@ -5205,7 +5205,7 @@
         <w:tc>
           <w:tcPr>
             <w:tcW w:type="dxa" w:w="2340"/>
-            <w:shd w:fill="1F4E79"/>
+            <w:shd w:fill="00593D"/>
           </w:tcPr>
           <w:p>
             <w:pPr>
@@ -5232,7 +5232,7 @@
         <w:tc>
           <w:tcPr>
             <w:tcW w:type="dxa" w:w="2340"/>
-            <w:shd w:fill="1F4E79"/>
+            <w:shd w:fill="00593D"/>
           </w:tcPr>
           <w:p>
             <w:pPr>
@@ -5259,7 +5259,7 @@
         <w:tc>
           <w:tcPr>
             <w:tcW w:type="dxa" w:w="2340"/>
-            <w:shd w:fill="1F4E79"/>
+            <w:shd w:fill="00593D"/>
           </w:tcPr>
           <w:p>
             <w:pPr>
@@ -5286,7 +5286,7 @@
         <w:tc>
           <w:tcPr>
             <w:tcW w:type="dxa" w:w="2340"/>
-            <w:shd w:fill="1F4E79"/>
+            <w:shd w:fill="00593D"/>
           </w:tcPr>
           <w:p>
             <w:pPr>
@@ -6398,7 +6398,7 @@
         <w:tc>
           <w:tcPr>
             <w:tcW w:type="dxa" w:w="4680"/>
-            <w:shd w:fill="1F4E79"/>
+            <w:shd w:fill="00593D"/>
           </w:tcPr>
           <w:p>
             <w:pPr>
@@ -6425,7 +6425,7 @@
         <w:tc>
           <w:tcPr>
             <w:tcW w:type="dxa" w:w="4680"/>
-            <w:shd w:fill="1F4E79"/>
+            <w:shd w:fill="00593D"/>
           </w:tcPr>
           <w:p>
             <w:pPr>
@@ -6716,7 +6716,7 @@
         <w:tc>
           <w:tcPr>
             <w:tcW w:type="dxa" w:w="3120"/>
-            <w:shd w:fill="1F4E79"/>
+            <w:shd w:fill="00593D"/>
           </w:tcPr>
           <w:p>
             <w:pPr>
@@ -6743,7 +6743,7 @@
         <w:tc>
           <w:tcPr>
             <w:tcW w:type="dxa" w:w="3120"/>
-            <w:shd w:fill="1F4E79"/>
+            <w:shd w:fill="00593D"/>
           </w:tcPr>
           <w:p>
             <w:pPr>
@@ -6770,7 +6770,7 @@
         <w:tc>
           <w:tcPr>
             <w:tcW w:type="dxa" w:w="3120"/>
-            <w:shd w:fill="1F4E79"/>
+            <w:shd w:fill="00593D"/>
           </w:tcPr>
           <w:p>
             <w:pPr>
@@ -7168,7 +7168,7 @@
         <w:tc>
           <w:tcPr>
             <w:tcW w:type="dxa" w:w="4680"/>
-            <w:shd w:fill="1F4E79"/>
+            <w:shd w:fill="00593D"/>
           </w:tcPr>
           <w:p>
             <w:pPr>
@@ -7195,7 +7195,7 @@
         <w:tc>
           <w:tcPr>
             <w:tcW w:type="dxa" w:w="4680"/>
-            <w:shd w:fill="1F4E79"/>
+            <w:shd w:fill="00593D"/>
           </w:tcPr>
           <w:p>
             <w:pPr>
@@ -7300,7 +7300,7 @@
         <w:tc>
           <w:tcPr>
             <w:tcW w:type="dxa" w:w="2340"/>
-            <w:shd w:fill="1F4E79"/>
+            <w:shd w:fill="00593D"/>
           </w:tcPr>
           <w:p>
             <w:pPr>
@@ -7327,7 +7327,7 @@
         <w:tc>
           <w:tcPr>
             <w:tcW w:type="dxa" w:w="2340"/>
-            <w:shd w:fill="1F4E79"/>
+            <w:shd w:fill="00593D"/>
           </w:tcPr>
           <w:p>
             <w:pPr>
@@ -7354,7 +7354,7 @@
         <w:tc>
           <w:tcPr>
             <w:tcW w:type="dxa" w:w="2340"/>
-            <w:shd w:fill="1F4E79"/>
+            <w:shd w:fill="00593D"/>
           </w:tcPr>
           <w:p>
             <w:pPr>
@@ -7381,7 +7381,7 @@
         <w:tc>
           <w:tcPr>
             <w:tcW w:type="dxa" w:w="2340"/>
-            <w:shd w:fill="1F4E79"/>
+            <w:shd w:fill="00593D"/>
           </w:tcPr>
           <w:p>
             <w:pPr>
@@ -7802,7 +7802,7 @@
         <w:tc>
           <w:tcPr>
             <w:tcW w:type="dxa" w:w="4680"/>
-            <w:shd w:fill="1F4E79"/>
+            <w:shd w:fill="00593D"/>
           </w:tcPr>
           <w:p>
             <w:pPr>
@@ -7829,7 +7829,7 @@
         <w:tc>
           <w:tcPr>
             <w:tcW w:type="dxa" w:w="4680"/>
-            <w:shd w:fill="1F4E79"/>
+            <w:shd w:fill="00593D"/>
           </w:tcPr>
           <w:p>
             <w:pPr>
@@ -8079,7 +8079,7 @@
         <w:tc>
           <w:tcPr>
             <w:tcW w:type="dxa" w:w="4680"/>
-            <w:shd w:fill="1F4E79"/>
+            <w:shd w:fill="00593D"/>
           </w:tcPr>
           <w:p>
             <w:pPr>
@@ -8106,7 +8106,7 @@
         <w:tc>
           <w:tcPr>
             <w:tcW w:type="dxa" w:w="4680"/>
-            <w:shd w:fill="1F4E79"/>
+            <w:shd w:fill="00593D"/>
           </w:tcPr>
           <w:p>
             <w:pPr>
@@ -8367,7 +8367,7 @@
         <w:tc>
           <w:tcPr>
             <w:tcW w:type="dxa" w:w="4680"/>
-            <w:shd w:fill="1F4E79"/>
+            <w:shd w:fill="00593D"/>
           </w:tcPr>
           <w:p>
             <w:pPr>
@@ -8394,7 +8394,7 @@
         <w:tc>
           <w:tcPr>
             <w:tcW w:type="dxa" w:w="4680"/>
-            <w:shd w:fill="1F4E79"/>
+            <w:shd w:fill="00593D"/>
           </w:tcPr>
           <w:p>
             <w:pPr>
@@ -8601,7 +8601,7 @@
         <w:tc>
           <w:tcPr>
             <w:tcW w:type="dxa" w:w="2340"/>
-            <w:shd w:fill="1F4E79"/>
+            <w:shd w:fill="00593D"/>
           </w:tcPr>
           <w:p>
             <w:pPr>
@@ -8628,7 +8628,7 @@
         <w:tc>
           <w:tcPr>
             <w:tcW w:type="dxa" w:w="2340"/>
-            <w:shd w:fill="1F4E79"/>
+            <w:shd w:fill="00593D"/>
           </w:tcPr>
           <w:p>
             <w:pPr>
@@ -8655,7 +8655,7 @@
         <w:tc>
           <w:tcPr>
             <w:tcW w:type="dxa" w:w="2340"/>
-            <w:shd w:fill="1F4E79"/>
+            <w:shd w:fill="00593D"/>
           </w:tcPr>
           <w:p>
             <w:pPr>
@@ -8682,7 +8682,7 @@
         <w:tc>
           <w:tcPr>
             <w:tcW w:type="dxa" w:w="2340"/>
-            <w:shd w:fill="1F4E79"/>
+            <w:shd w:fill="00593D"/>
           </w:tcPr>
           <w:p>
             <w:pPr>
@@ -8977,7 +8977,7 @@
         <w:tc>
           <w:tcPr>
             <w:tcW w:type="dxa" w:w="2340"/>
-            <w:shd w:fill="1F4E79"/>
+            <w:shd w:fill="00593D"/>
           </w:tcPr>
           <w:p>
             <w:pPr>
@@ -9004,7 +9004,7 @@
         <w:tc>
           <w:tcPr>
             <w:tcW w:type="dxa" w:w="2340"/>
-            <w:shd w:fill="1F4E79"/>
+            <w:shd w:fill="00593D"/>
           </w:tcPr>
           <w:p>
             <w:pPr>
@@ -9031,7 +9031,7 @@
         <w:tc>
           <w:tcPr>
             <w:tcW w:type="dxa" w:w="2340"/>
-            <w:shd w:fill="1F4E79"/>
+            <w:shd w:fill="00593D"/>
           </w:tcPr>
           <w:p>
             <w:pPr>
@@ -9058,7 +9058,7 @@
         <w:tc>
           <w:tcPr>
             <w:tcW w:type="dxa" w:w="2340"/>
-            <w:shd w:fill="1F4E79"/>
+            <w:shd w:fill="00593D"/>
           </w:tcPr>
           <w:p>
             <w:pPr>
@@ -9434,7 +9434,7 @@
         <w:tc>
           <w:tcPr>
             <w:tcW w:type="dxa" w:w="2340"/>
-            <w:shd w:fill="1F4E79"/>
+            <w:shd w:fill="00593D"/>
           </w:tcPr>
           <w:p>
             <w:pPr>
@@ -9461,7 +9461,7 @@
         <w:tc>
           <w:tcPr>
             <w:tcW w:type="dxa" w:w="2340"/>
-            <w:shd w:fill="1F4E79"/>
+            <w:shd w:fill="00593D"/>
           </w:tcPr>
           <w:p>
             <w:pPr>
@@ -9488,7 +9488,7 @@
         <w:tc>
           <w:tcPr>
             <w:tcW w:type="dxa" w:w="2340"/>
-            <w:shd w:fill="1F4E79"/>
+            <w:shd w:fill="00593D"/>
           </w:tcPr>
           <w:p>
             <w:pPr>
@@ -9515,7 +9515,7 @@
         <w:tc>
           <w:tcPr>
             <w:tcW w:type="dxa" w:w="2340"/>
-            <w:shd w:fill="1F4E79"/>
+            <w:shd w:fill="00593D"/>
           </w:tcPr>
           <w:p>
             <w:pPr>
@@ -9891,7 +9891,7 @@
         <w:tc>
           <w:tcPr>
             <w:tcW w:type="dxa" w:w="2340"/>
-            <w:shd w:fill="1F4E79"/>
+            <w:shd w:fill="00593D"/>
           </w:tcPr>
           <w:p>
             <w:pPr>
@@ -9918,7 +9918,7 @@
         <w:tc>
           <w:tcPr>
             <w:tcW w:type="dxa" w:w="2340"/>
-            <w:shd w:fill="1F4E79"/>
+            <w:shd w:fill="00593D"/>
           </w:tcPr>
           <w:p>
             <w:pPr>
@@ -9945,7 +9945,7 @@
         <w:tc>
           <w:tcPr>
             <w:tcW w:type="dxa" w:w="2340"/>
-            <w:shd w:fill="1F4E79"/>
+            <w:shd w:fill="00593D"/>
           </w:tcPr>
           <w:p>
             <w:pPr>
@@ -9972,7 +9972,7 @@
         <w:tc>
           <w:tcPr>
             <w:tcW w:type="dxa" w:w="2340"/>
-            <w:shd w:fill="1F4E79"/>
+            <w:shd w:fill="00593D"/>
           </w:tcPr>
           <w:p>
             <w:pPr>
@@ -10195,7 +10195,7 @@
         <w:tc>
           <w:tcPr>
             <w:tcW w:type="dxa" w:w="4680"/>
-            <w:shd w:fill="1F4E79"/>
+            <w:shd w:fill="00593D"/>
           </w:tcPr>
           <w:p>
             <w:pPr>
@@ -10222,7 +10222,7 @@
         <w:tc>
           <w:tcPr>
             <w:tcW w:type="dxa" w:w="4680"/>
-            <w:shd w:fill="1F4E79"/>
+            <w:shd w:fill="00593D"/>
           </w:tcPr>
           <w:p>
             <w:pPr>
@@ -10628,7 +10628,7 @@
         <w:tc>
           <w:tcPr>
             <w:tcW w:type="dxa" w:w="4680"/>
-            <w:shd w:fill="1F4E79"/>
+            <w:shd w:fill="00593D"/>
           </w:tcPr>
           <w:p>
             <w:pPr>
@@ -10655,7 +10655,7 @@
         <w:tc>
           <w:tcPr>
             <w:tcW w:type="dxa" w:w="4680"/>
-            <w:shd w:fill="1F4E79"/>
+            <w:shd w:fill="00593D"/>
           </w:tcPr>
           <w:p>
             <w:pPr>
@@ -11097,7 +11097,7 @@
         <w:tc>
           <w:tcPr>
             <w:tcW w:type="dxa" w:w="3120"/>
-            <w:shd w:fill="1F4E79"/>
+            <w:shd w:fill="00593D"/>
           </w:tcPr>
           <w:p>
             <w:pPr>
@@ -11124,7 +11124,7 @@
         <w:tc>
           <w:tcPr>
             <w:tcW w:type="dxa" w:w="3120"/>
-            <w:shd w:fill="1F4E79"/>
+            <w:shd w:fill="00593D"/>
           </w:tcPr>
           <w:p>
             <w:pPr>
@@ -11151,7 +11151,7 @@
         <w:tc>
           <w:tcPr>
             <w:tcW w:type="dxa" w:w="3120"/>
-            <w:shd w:fill="1F4E79"/>
+            <w:shd w:fill="00593D"/>
           </w:tcPr>
           <w:p>
             <w:pPr>
@@ -11676,7 +11676,7 @@
         <w:tc>
           <w:tcPr>
             <w:tcW w:type="dxa" w:w="3120"/>
-            <w:shd w:fill="1F4E79"/>
+            <w:shd w:fill="00593D"/>
           </w:tcPr>
           <w:p>
             <w:pPr>
@@ -11703,7 +11703,7 @@
         <w:tc>
           <w:tcPr>
             <w:tcW w:type="dxa" w:w="3120"/>
-            <w:shd w:fill="1F4E79"/>
+            <w:shd w:fill="00593D"/>
           </w:tcPr>
           <w:p>
             <w:pPr>
@@ -11730,7 +11730,7 @@
         <w:tc>
           <w:tcPr>
             <w:tcW w:type="dxa" w:w="3120"/>
-            <w:shd w:fill="1F4E79"/>
+            <w:shd w:fill="00593D"/>
           </w:tcPr>
           <w:p>
             <w:pPr>
@@ -12263,7 +12263,7 @@
         <w:tc>
           <w:tcPr>
             <w:tcW w:type="dxa" w:w="3120"/>
-            <w:shd w:fill="1F4E79"/>
+            <w:shd w:fill="00593D"/>
           </w:tcPr>
           <w:p>
             <w:pPr>
@@ -12290,7 +12290,7 @@
         <w:tc>
           <w:tcPr>
             <w:tcW w:type="dxa" w:w="3120"/>
-            <w:shd w:fill="1F4E79"/>
+            <w:shd w:fill="00593D"/>
           </w:tcPr>
           <w:p>
             <w:pPr>
@@ -12317,7 +12317,7 @@
         <w:tc>
           <w:tcPr>
             <w:tcW w:type="dxa" w:w="3120"/>
-            <w:shd w:fill="1F4E79"/>
+            <w:shd w:fill="00593D"/>
           </w:tcPr>
           <w:p>
             <w:pPr>
@@ -12596,7 +12596,7 @@
         <w:tc>
           <w:tcPr>
             <w:tcW w:type="dxa" w:w="3120"/>
-            <w:shd w:fill="1F4E79"/>
+            <w:shd w:fill="00593D"/>
           </w:tcPr>
           <w:p>
             <w:pPr>
@@ -12623,7 +12623,7 @@
         <w:tc>
           <w:tcPr>
             <w:tcW w:type="dxa" w:w="3120"/>
-            <w:shd w:fill="1F4E79"/>
+            <w:shd w:fill="00593D"/>
           </w:tcPr>
           <w:p>
             <w:pPr>
@@ -12650,7 +12650,7 @@
         <w:tc>
           <w:tcPr>
             <w:tcW w:type="dxa" w:w="3120"/>
-            <w:shd w:fill="1F4E79"/>
+            <w:shd w:fill="00593D"/>
           </w:tcPr>
           <w:p>
             <w:pPr>
@@ -13113,7 +13113,7 @@
         <w:tc>
           <w:tcPr>
             <w:tcW w:type="dxa" w:w="3120"/>
-            <w:shd w:fill="1F4E79"/>
+            <w:shd w:fill="00593D"/>
           </w:tcPr>
           <w:p>
             <w:pPr>
@@ -13140,7 +13140,7 @@
         <w:tc>
           <w:tcPr>
             <w:tcW w:type="dxa" w:w="3120"/>
-            <w:shd w:fill="1F4E79"/>
+            <w:shd w:fill="00593D"/>
           </w:tcPr>
           <w:p>
             <w:pPr>
@@ -13167,7 +13167,7 @@
         <w:tc>
           <w:tcPr>
             <w:tcW w:type="dxa" w:w="3120"/>
-            <w:shd w:fill="1F4E79"/>
+            <w:shd w:fill="00593D"/>
           </w:tcPr>
           <w:p>
             <w:pPr>
@@ -13416,7 +13416,7 @@
         <w:tc>
           <w:tcPr>
             <w:tcW w:type="dxa" w:w="3120"/>
-            <w:shd w:fill="1F4E79"/>
+            <w:shd w:fill="00593D"/>
           </w:tcPr>
           <w:p>
             <w:pPr>
@@ -13443,7 +13443,7 @@
         <w:tc>
           <w:tcPr>
             <w:tcW w:type="dxa" w:w="3120"/>
-            <w:shd w:fill="1F4E79"/>
+            <w:shd w:fill="00593D"/>
           </w:tcPr>
           <w:p>
             <w:pPr>
@@ -13470,7 +13470,7 @@
         <w:tc>
           <w:tcPr>
             <w:tcW w:type="dxa" w:w="3120"/>
-            <w:shd w:fill="1F4E79"/>
+            <w:shd w:fill="00593D"/>
           </w:tcPr>
           <w:p>
             <w:pPr>
@@ -13698,7 +13698,7 @@
         <w:tc>
           <w:tcPr>
             <w:tcW w:type="dxa" w:w="2340"/>
-            <w:shd w:fill="1F4E79"/>
+            <w:shd w:fill="00593D"/>
           </w:tcPr>
           <w:p>
             <w:pPr>
@@ -13725,7 +13725,7 @@
         <w:tc>
           <w:tcPr>
             <w:tcW w:type="dxa" w:w="2340"/>
-            <w:shd w:fill="1F4E79"/>
+            <w:shd w:fill="00593D"/>
           </w:tcPr>
           <w:p>
             <w:pPr>
@@ -13752,7 +13752,7 @@
         <w:tc>
           <w:tcPr>
             <w:tcW w:type="dxa" w:w="2340"/>
-            <w:shd w:fill="1F4E79"/>
+            <w:shd w:fill="00593D"/>
           </w:tcPr>
           <w:p>
             <w:pPr>
@@ -13779,7 +13779,7 @@
         <w:tc>
           <w:tcPr>
             <w:tcW w:type="dxa" w:w="2340"/>
-            <w:shd w:fill="1F4E79"/>
+            <w:shd w:fill="00593D"/>
           </w:tcPr>
           <w:p>
             <w:pPr>
@@ -14175,7 +14175,7 @@
         <w:tc>
           <w:tcPr>
             <w:tcW w:type="dxa" w:w="3120"/>
-            <w:shd w:fill="1F4E79"/>
+            <w:shd w:fill="00593D"/>
           </w:tcPr>
           <w:p>
             <w:pPr>
@@ -14202,7 +14202,7 @@
         <w:tc>
           <w:tcPr>
             <w:tcW w:type="dxa" w:w="3120"/>
-            <w:shd w:fill="1F4E79"/>
+            <w:shd w:fill="00593D"/>
           </w:tcPr>
           <w:p>
             <w:pPr>
@@ -14229,7 +14229,7 @@
         <w:tc>
           <w:tcPr>
             <w:tcW w:type="dxa" w:w="3120"/>
-            <w:shd w:fill="1F4E79"/>
+            <w:shd w:fill="00593D"/>
           </w:tcPr>
           <w:p>
             <w:pPr>
@@ -14548,7 +14548,7 @@
         <w:tc>
           <w:tcPr>
             <w:tcW w:type="dxa" w:w="3120"/>
-            <w:shd w:fill="1F4E79"/>
+            <w:shd w:fill="00593D"/>
           </w:tcPr>
           <w:p>
             <w:pPr>
@@ -14575,7 +14575,7 @@
         <w:tc>
           <w:tcPr>
             <w:tcW w:type="dxa" w:w="3120"/>
-            <w:shd w:fill="1F4E79"/>
+            <w:shd w:fill="00593D"/>
           </w:tcPr>
           <w:p>
             <w:pPr>
@@ -14602,7 +14602,7 @@
         <w:tc>
           <w:tcPr>
             <w:tcW w:type="dxa" w:w="3120"/>
-            <w:shd w:fill="1F4E79"/>
+            <w:shd w:fill="00593D"/>
           </w:tcPr>
           <w:p>
             <w:pPr>
@@ -15171,7 +15171,7 @@
         <w:tc>
           <w:tcPr>
             <w:tcW w:type="dxa" w:w="3120"/>
-            <w:shd w:fill="1F4E79"/>
+            <w:shd w:fill="00593D"/>
           </w:tcPr>
           <w:p>
             <w:pPr>
@@ -15198,7 +15198,7 @@
         <w:tc>
           <w:tcPr>
             <w:tcW w:type="dxa" w:w="3120"/>
-            <w:shd w:fill="1F4E79"/>
+            <w:shd w:fill="00593D"/>
           </w:tcPr>
           <w:p>
             <w:pPr>
@@ -15225,7 +15225,7 @@
         <w:tc>
           <w:tcPr>
             <w:tcW w:type="dxa" w:w="3120"/>
-            <w:shd w:fill="1F4E79"/>
+            <w:shd w:fill="00593D"/>
           </w:tcPr>
           <w:p>
             <w:pPr>
@@ -15409,7 +15409,7 @@
         <w:tc>
           <w:tcPr>
             <w:tcW w:type="dxa" w:w="4680"/>
-            <w:shd w:fill="1F4E79"/>
+            <w:shd w:fill="00593D"/>
           </w:tcPr>
           <w:p>
             <w:pPr>
@@ -15436,7 +15436,7 @@
         <w:tc>
           <w:tcPr>
             <w:tcW w:type="dxa" w:w="4680"/>
-            <w:shd w:fill="1F4E79"/>
+            <w:shd w:fill="00593D"/>
           </w:tcPr>
           <w:p>
             <w:pPr>
@@ -15749,7 +15749,7 @@
         <w:tc>
           <w:tcPr>
             <w:tcW w:type="dxa" w:w="4680"/>
-            <w:shd w:fill="1F4E79"/>
+            <w:shd w:fill="00593D"/>
           </w:tcPr>
           <w:p>
             <w:pPr>
@@ -15776,7 +15776,7 @@
         <w:tc>
           <w:tcPr>
             <w:tcW w:type="dxa" w:w="4680"/>
-            <w:shd w:fill="1F4E79"/>
+            <w:shd w:fill="00593D"/>
           </w:tcPr>
           <w:p>
             <w:pPr>
@@ -16225,7 +16225,7 @@
         <w:tc>
           <w:tcPr>
             <w:tcW w:type="dxa" w:w="2340"/>
-            <w:shd w:fill="1F4E79"/>
+            <w:shd w:fill="00593D"/>
           </w:tcPr>
           <w:p>
             <w:pPr>
@@ -16252,7 +16252,7 @@
         <w:tc>
           <w:tcPr>
             <w:tcW w:type="dxa" w:w="2340"/>
-            <w:shd w:fill="1F4E79"/>
+            <w:shd w:fill="00593D"/>
           </w:tcPr>
           <w:p>
             <w:pPr>
@@ -16279,7 +16279,7 @@
         <w:tc>
           <w:tcPr>
             <w:tcW w:type="dxa" w:w="2340"/>
-            <w:shd w:fill="1F4E79"/>
+            <w:shd w:fill="00593D"/>
           </w:tcPr>
           <w:p>
             <w:pPr>
@@ -16306,7 +16306,7 @@
         <w:tc>
           <w:tcPr>
             <w:tcW w:type="dxa" w:w="2340"/>
-            <w:shd w:fill="1F4E79"/>
+            <w:shd w:fill="00593D"/>
           </w:tcPr>
           <w:p>
             <w:pPr>
@@ -16696,7 +16696,7 @@
         <w:tc>
           <w:tcPr>
             <w:tcW w:type="dxa" w:w="4680"/>
-            <w:shd w:fill="1F4E79"/>
+            <w:shd w:fill="00593D"/>
           </w:tcPr>
           <w:p>
             <w:pPr>
@@ -16723,7 +16723,7 @@
         <w:tc>
           <w:tcPr>
             <w:tcW w:type="dxa" w:w="4680"/>
-            <w:shd w:fill="1F4E79"/>
+            <w:shd w:fill="00593D"/>
           </w:tcPr>
           <w:p>
             <w:pPr>
@@ -16868,7 +16868,7 @@
         <w:tc>
           <w:tcPr>
             <w:tcW w:type="dxa" w:w="3120"/>
-            <w:shd w:fill="1F4E79"/>
+            <w:shd w:fill="00593D"/>
           </w:tcPr>
           <w:p>
             <w:pPr>
@@ -16895,7 +16895,7 @@
         <w:tc>
           <w:tcPr>
             <w:tcW w:type="dxa" w:w="3120"/>
-            <w:shd w:fill="1F4E79"/>
+            <w:shd w:fill="00593D"/>
           </w:tcPr>
           <w:p>
             <w:pPr>
@@ -16922,7 +16922,7 @@
         <w:tc>
           <w:tcPr>
             <w:tcW w:type="dxa" w:w="3120"/>
-            <w:shd w:fill="1F4E79"/>
+            <w:shd w:fill="00593D"/>
           </w:tcPr>
           <w:p>
             <w:pPr>
@@ -17165,7 +17165,7 @@
         <w:tc>
           <w:tcPr>
             <w:tcW w:type="dxa" w:w="3120"/>
-            <w:shd w:fill="1F4E79"/>
+            <w:shd w:fill="00593D"/>
           </w:tcPr>
           <w:p>
             <w:pPr>
@@ -17192,7 +17192,7 @@
         <w:tc>
           <w:tcPr>
             <w:tcW w:type="dxa" w:w="3120"/>
-            <w:shd w:fill="1F4E79"/>
+            <w:shd w:fill="00593D"/>
           </w:tcPr>
           <w:p>
             <w:pPr>
@@ -17219,7 +17219,7 @@
         <w:tc>
           <w:tcPr>
             <w:tcW w:type="dxa" w:w="3120"/>
-            <w:shd w:fill="1F4E79"/>
+            <w:shd w:fill="00593D"/>
           </w:tcPr>
           <w:p>
             <w:pPr>
@@ -17525,7 +17525,7 @@
         <w:tc>
           <w:tcPr>
             <w:tcW w:type="dxa" w:w="4680"/>
-            <w:shd w:fill="1F4E79"/>
+            <w:shd w:fill="00593D"/>
           </w:tcPr>
           <w:p>
             <w:pPr>
@@ -17552,7 +17552,7 @@
         <w:tc>
           <w:tcPr>
             <w:tcW w:type="dxa" w:w="4680"/>
-            <w:shd w:fill="1F4E79"/>
+            <w:shd w:fill="00593D"/>
           </w:tcPr>
           <w:p>
             <w:pPr>
@@ -17696,7 +17696,7 @@
         <w:tc>
           <w:tcPr>
             <w:tcW w:type="dxa" w:w="4680"/>
-            <w:shd w:fill="1F4E79"/>
+            <w:shd w:fill="00593D"/>
           </w:tcPr>
           <w:p>
             <w:pPr>
@@ -17723,7 +17723,7 @@
         <w:tc>
           <w:tcPr>
             <w:tcW w:type="dxa" w:w="4680"/>
-            <w:shd w:fill="1F4E79"/>
+            <w:shd w:fill="00593D"/>
           </w:tcPr>
           <w:p>
             <w:pPr>
@@ -18153,7 +18153,7 @@
         <w:tc>
           <w:tcPr>
             <w:tcW w:type="dxa" w:w="3120"/>
-            <w:shd w:fill="1F4E79"/>
+            <w:shd w:fill="00593D"/>
           </w:tcPr>
           <w:p>
             <w:pPr>
@@ -18180,7 +18180,7 @@
         <w:tc>
           <w:tcPr>
             <w:tcW w:type="dxa" w:w="3120"/>
-            <w:shd w:fill="1F4E79"/>
+            <w:shd w:fill="00593D"/>
           </w:tcPr>
           <w:p>
             <w:pPr>
@@ -18207,7 +18207,7 @@
         <w:tc>
           <w:tcPr>
             <w:tcW w:type="dxa" w:w="3120"/>
-            <w:shd w:fill="1F4E79"/>
+            <w:shd w:fill="00593D"/>
           </w:tcPr>
           <w:p>
             <w:pPr>
@@ -18385,7 +18385,7 @@
         <w:tc>
           <w:tcPr>
             <w:tcW w:type="dxa" w:w="4680"/>
-            <w:shd w:fill="1F4E79"/>
+            <w:shd w:fill="00593D"/>
           </w:tcPr>
           <w:p>
             <w:pPr>
@@ -18412,7 +18412,7 @@
         <w:tc>
           <w:tcPr>
             <w:tcW w:type="dxa" w:w="4680"/>
-            <w:shd w:fill="1F4E79"/>
+            <w:shd w:fill="00593D"/>
           </w:tcPr>
           <w:p>
             <w:pPr>
@@ -18855,7 +18855,7 @@
         <w:tc>
           <w:tcPr>
             <w:tcW w:type="dxa" w:w="2340"/>
-            <w:shd w:fill="1F4E79"/>
+            <w:shd w:fill="00593D"/>
           </w:tcPr>
           <w:p>
             <w:pPr>
@@ -18882,7 +18882,7 @@
         <w:tc>
           <w:tcPr>
             <w:tcW w:type="dxa" w:w="2340"/>
-            <w:shd w:fill="1F4E79"/>
+            <w:shd w:fill="00593D"/>
           </w:tcPr>
           <w:p>
             <w:pPr>
@@ -18909,7 +18909,7 @@
         <w:tc>
           <w:tcPr>
             <w:tcW w:type="dxa" w:w="2340"/>
-            <w:shd w:fill="1F4E79"/>
+            <w:shd w:fill="00593D"/>
           </w:tcPr>
           <w:p>
             <w:pPr>
@@ -18936,7 +18936,7 @@
         <w:tc>
           <w:tcPr>
             <w:tcW w:type="dxa" w:w="2340"/>
-            <w:shd w:fill="1F4E79"/>
+            <w:shd w:fill="00593D"/>
           </w:tcPr>
           <w:p>
             <w:pPr>
@@ -19233,7 +19233,7 @@
         <w:tc>
           <w:tcPr>
             <w:tcW w:type="dxa" w:w="3120"/>
-            <w:shd w:fill="1F4E79"/>
+            <w:shd w:fill="00593D"/>
           </w:tcPr>
           <w:p>
             <w:pPr>
@@ -19260,7 +19260,7 @@
         <w:tc>
           <w:tcPr>
             <w:tcW w:type="dxa" w:w="3120"/>
-            <w:shd w:fill="1F4E79"/>
+            <w:shd w:fill="00593D"/>
           </w:tcPr>
           <w:p>
             <w:pPr>
@@ -19287,7 +19287,7 @@
         <w:tc>
           <w:tcPr>
             <w:tcW w:type="dxa" w:w="3120"/>
-            <w:shd w:fill="1F4E79"/>
+            <w:shd w:fill="00593D"/>
           </w:tcPr>
           <w:p>
             <w:pPr>
@@ -19772,7 +19772,7 @@
         <w:tc>
           <w:tcPr>
             <w:tcW w:type="dxa" w:w="2340"/>
-            <w:shd w:fill="1F4E79"/>
+            <w:shd w:fill="00593D"/>
           </w:tcPr>
           <w:p>
             <w:pPr>
@@ -19799,7 +19799,7 @@
         <w:tc>
           <w:tcPr>
             <w:tcW w:type="dxa" w:w="2340"/>
-            <w:shd w:fill="1F4E79"/>
+            <w:shd w:fill="00593D"/>
           </w:tcPr>
           <w:p>
             <w:pPr>
@@ -19826,7 +19826,7 @@
         <w:tc>
           <w:tcPr>
             <w:tcW w:type="dxa" w:w="2340"/>
-            <w:shd w:fill="1F4E79"/>
+            <w:shd w:fill="00593D"/>
           </w:tcPr>
           <w:p>
             <w:pPr>
@@ -19853,7 +19853,7 @@
         <w:tc>
           <w:tcPr>
             <w:tcW w:type="dxa" w:w="2340"/>
-            <w:shd w:fill="1F4E79"/>
+            <w:shd w:fill="00593D"/>
           </w:tcPr>
           <w:p>
             <w:pPr>
@@ -20451,7 +20451,7 @@
         <w:tc>
           <w:tcPr>
             <w:tcW w:type="dxa" w:w="3120"/>
-            <w:shd w:fill="1F4E79"/>
+            <w:shd w:fill="00593D"/>
           </w:tcPr>
           <w:p>
             <w:pPr>
@@ -20478,7 +20478,7 @@
         <w:tc>
           <w:tcPr>
             <w:tcW w:type="dxa" w:w="3120"/>
-            <w:shd w:fill="1F4E79"/>
+            <w:shd w:fill="00593D"/>
           </w:tcPr>
           <w:p>
             <w:pPr>
@@ -20505,7 +20505,7 @@
         <w:tc>
           <w:tcPr>
             <w:tcW w:type="dxa" w:w="3120"/>
-            <w:shd w:fill="1F4E79"/>
+            <w:shd w:fill="00593D"/>
           </w:tcPr>
           <w:p>
             <w:pPr>
@@ -20751,7 +20751,7 @@
         <w:tc>
           <w:tcPr>
             <w:tcW w:type="dxa" w:w="3120"/>
-            <w:shd w:fill="1F4E79"/>
+            <w:shd w:fill="00593D"/>
           </w:tcPr>
           <w:p>
             <w:pPr>
@@ -20778,7 +20778,7 @@
         <w:tc>
           <w:tcPr>
             <w:tcW w:type="dxa" w:w="3120"/>
-            <w:shd w:fill="1F4E79"/>
+            <w:shd w:fill="00593D"/>
           </w:tcPr>
           <w:p>
             <w:pPr>
@@ -20805,7 +20805,7 @@
         <w:tc>
           <w:tcPr>
             <w:tcW w:type="dxa" w:w="3120"/>
-            <w:shd w:fill="1F4E79"/>
+            <w:shd w:fill="00593D"/>
           </w:tcPr>
           <w:p>
             <w:pPr>
@@ -21073,7 +21073,7 @@
         <w:tc>
           <w:tcPr>
             <w:tcW w:type="dxa" w:w="3120"/>
-            <w:shd w:fill="1F4E79"/>
+            <w:shd w:fill="00593D"/>
           </w:tcPr>
           <w:p>
             <w:pPr>
@@ -21100,7 +21100,7 @@
         <w:tc>
           <w:tcPr>
             <w:tcW w:type="dxa" w:w="3120"/>
-            <w:shd w:fill="1F4E79"/>
+            <w:shd w:fill="00593D"/>
           </w:tcPr>
           <w:p>
             <w:pPr>
@@ -21127,7 +21127,7 @@
         <w:tc>
           <w:tcPr>
             <w:tcW w:type="dxa" w:w="3120"/>
-            <w:shd w:fill="1F4E79"/>
+            <w:shd w:fill="00593D"/>
           </w:tcPr>
           <w:p>
             <w:pPr>
@@ -21448,7 +21448,7 @@
         <w:tc>
           <w:tcPr>
             <w:tcW w:type="dxa" w:w="4680"/>
-            <w:shd w:fill="1F4E79"/>
+            <w:shd w:fill="00593D"/>
           </w:tcPr>
           <w:p>
             <w:pPr>
@@ -21475,7 +21475,7 @@
         <w:tc>
           <w:tcPr>
             <w:tcW w:type="dxa" w:w="4680"/>
-            <w:shd w:fill="1F4E79"/>
+            <w:shd w:fill="00593D"/>
           </w:tcPr>
           <w:p>
             <w:pPr>
@@ -21714,7 +21714,7 @@
         <w:tc>
           <w:tcPr>
             <w:tcW w:type="dxa" w:w="3120"/>
-            <w:shd w:fill="1F4E79"/>
+            <w:shd w:fill="00593D"/>
           </w:tcPr>
           <w:p>
             <w:pPr>
@@ -21741,7 +21741,7 @@
         <w:tc>
           <w:tcPr>
             <w:tcW w:type="dxa" w:w="3120"/>
-            <w:shd w:fill="1F4E79"/>
+            <w:shd w:fill="00593D"/>
           </w:tcPr>
           <w:p>
             <w:pPr>
@@ -21768,7 +21768,7 @@
         <w:tc>
           <w:tcPr>
             <w:tcW w:type="dxa" w:w="3120"/>
-            <w:shd w:fill="1F4E79"/>
+            <w:shd w:fill="00593D"/>
           </w:tcPr>
           <w:p>
             <w:pPr>
@@ -23880,7 +23880,7 @@
       <w:rFonts w:asciiTheme="majorHAnsi" w:eastAsiaTheme="majorEastAsia" w:hAnsiTheme="majorHAnsi" w:cstheme="majorBidi" w:ascii="Calibri" w:hAnsi="Calibri"/>
       <w:b/>
       <w:bCs/>
-      <w:color w:val="1F4E79"/>
+      <w:color w:val="00593D"/>
       <w:sz w:val="44"/>
       <w:szCs w:val="28"/>
     </w:rPr>
@@ -23904,7 +23904,7 @@
       <w:rFonts w:asciiTheme="majorHAnsi" w:eastAsiaTheme="majorEastAsia" w:hAnsiTheme="majorHAnsi" w:cstheme="majorBidi" w:ascii="Calibri" w:hAnsi="Calibri"/>
       <w:b/>
       <w:bCs/>
-      <w:color w:val="1F4E79"/>
+      <w:color w:val="00593D"/>
       <w:sz w:val="32"/>
       <w:szCs w:val="26"/>
     </w:rPr>
@@ -23928,7 +23928,7 @@
       <w:rFonts w:asciiTheme="majorHAnsi" w:eastAsiaTheme="majorEastAsia" w:hAnsiTheme="majorHAnsi" w:cstheme="majorBidi" w:ascii="Calibri" w:hAnsi="Calibri"/>
       <w:b/>
       <w:bCs/>
-      <w:color w:val="2E75B6"/>
+      <w:color w:val="03425B"/>
       <w:sz w:val="26"/>
     </w:rPr>
   </w:style>
@@ -23954,7 +23954,7 @@
       <w:bCs/>
       <w:i/>
       <w:iCs/>
-      <w:color w:val="2E75B6"/>
+      <w:color w:val="03425B"/>
       <w:sz w:val="22"/>
     </w:rPr>
   </w:style>

</xml_diff>